<commit_message>
v26.0: opening balances (contractors + suppliers), supplier statement of account, 'Printing' tab with general payment voucher (PR-xxxx) on the company form; user guide updated
Co-Authored-By: Claude Sonnet 5.5 <noreply@anthropic.com>
Claude-Session: https://claude.ai/code/session_01SHGXLMzTpjgSYCYG6UniWT
</commit_message>
<xml_diff>
--- a/po_web/docs/دليل_المستخدم.docx
+++ b/po_web/docs/دليل_المستخدم.docx
@@ -3278,7 +3278,1365 @@
           <w:szCs w:val="36"/>
           <w:bCs/>
         </w:rPr>
-        <w:t>7. الأرشيف وإقفال المعاملة</w:t>
+        <w:t>7. رصيد الافتتاح (ترحيل الأرصدة من النظام القديم)</w:t>
+      </w:r>
+    </w:p>
+    <w:p>
+      <w:pPr>
+        <w:bidi/>
+        <w:spacing w:after="120"/>
+        <w:jc w:val="right"/>
+      </w:pPr>
+      <w:r>
+        <w:rPr>
+          <w:b w:val="0"/>
+          <w:sz w:val="22"/>
+          <w:rtl/>
+          <w:rFonts w:ascii="Tahoma" w:hAnsi="Tahoma" w:cs="Tahoma" w:eastAsia="Tahoma"/>
+          <w:szCs w:val="22"/>
+        </w:rPr>
+        <w:t>عند بدء العمل الفعلي نسجّل ما كان مستحقاً لكل مقاول ومورد (أو عليه) في النظام القديم، فيبدأ النظام الجديد من هذا الرصيد ولا يُعاد إدخال ما قبله.</w:t>
+      </w:r>
+    </w:p>
+    <w:p>
+      <w:pPr>
+        <w:keepNext/>
+        <w:bidi/>
+        <w:spacing w:after="80" w:before="160"/>
+        <w:jc w:val="right"/>
+      </w:pPr>
+      <w:r>
+        <w:rPr>
+          <w:b/>
+          <w:color w:val="29595E"/>
+          <w:sz w:val="26"/>
+          <w:rtl/>
+          <w:rFonts w:ascii="Tahoma" w:hAnsi="Tahoma" w:cs="Tahoma" w:eastAsia="Tahoma"/>
+          <w:szCs w:val="26"/>
+          <w:bCs/>
+        </w:rPr>
+        <w:t>معنى الاتجاه</w:t>
+      </w:r>
+    </w:p>
+    <w:tbl>
+      <w:tblPr>
+        <w:tblStyle w:val="TableGrid"/>
+        <w:tblW w:type="auto" w:w="0"/>
+        <w:jc w:val="center"/>
+        <w:tblLayout w:type="fixed"/>
+        <w:tblLook w:firstColumn="1" w:firstRow="1" w:lastColumn="0" w:lastRow="0" w:noHBand="0" w:noVBand="1" w:val="04A0"/>
+        <w:bidiVisual/>
+        <w:tblLayout w:type="fixed"/>
+      </w:tblPr>
+      <w:tblGrid>
+        <w:gridCol w:w="3118"/>
+        <w:gridCol w:w="3402"/>
+        <w:gridCol w:w="3118"/>
+      </w:tblGrid>
+      <w:tr>
+        <w:tc>
+          <w:tcPr>
+            <w:tcW w:type="dxa" w:w="3118"/>
+            <w:shd w:val="clear" w:color="auto" w:fill="29595E"/>
+          </w:tcPr>
+          <w:p>
+            <w:pPr>
+              <w:bidi/>
+              <w:jc w:val="right"/>
+            </w:pPr>
+            <w:r>
+              <w:rPr>
+                <w:b/>
+                <w:color w:val="FFFFFF"/>
+                <w:sz w:val="21"/>
+                <w:rtl/>
+                <w:rFonts w:ascii="Tahoma" w:hAnsi="Tahoma" w:cs="Tahoma" w:eastAsia="Tahoma"/>
+                <w:szCs w:val="21"/>
+                <w:bCs/>
+              </w:rPr>
+              <w:t>الاختيار</w:t>
+            </w:r>
+          </w:p>
+        </w:tc>
+        <w:tc>
+          <w:tcPr>
+            <w:tcW w:type="dxa" w:w="3402"/>
+            <w:shd w:val="clear" w:color="auto" w:fill="29595E"/>
+          </w:tcPr>
+          <w:p>
+            <w:pPr>
+              <w:bidi/>
+              <w:jc w:val="right"/>
+            </w:pPr>
+            <w:r>
+              <w:rPr>
+                <w:b/>
+                <w:color w:val="FFFFFF"/>
+                <w:sz w:val="21"/>
+                <w:rtl/>
+                <w:rFonts w:ascii="Tahoma" w:hAnsi="Tahoma" w:cs="Tahoma" w:eastAsia="Tahoma"/>
+                <w:szCs w:val="21"/>
+                <w:bCs/>
+              </w:rPr>
+              <w:t>متى؟</w:t>
+            </w:r>
+          </w:p>
+        </w:tc>
+        <w:tc>
+          <w:tcPr>
+            <w:tcW w:type="dxa" w:w="3118"/>
+            <w:shd w:val="clear" w:color="auto" w:fill="29595E"/>
+          </w:tcPr>
+          <w:p>
+            <w:pPr>
+              <w:bidi/>
+              <w:jc w:val="right"/>
+            </w:pPr>
+            <w:r>
+              <w:rPr>
+                <w:b/>
+                <w:color w:val="FFFFFF"/>
+                <w:sz w:val="21"/>
+                <w:rtl/>
+                <w:rFonts w:ascii="Tahoma" w:hAnsi="Tahoma" w:cs="Tahoma" w:eastAsia="Tahoma"/>
+                <w:szCs w:val="21"/>
+                <w:bCs/>
+              </w:rPr>
+              <w:t>أثره في الكشف</w:t>
+            </w:r>
+          </w:p>
+        </w:tc>
+      </w:tr>
+      <w:tr>
+        <w:tc>
+          <w:tcPr>
+            <w:tcW w:type="dxa" w:w="3118"/>
+          </w:tcPr>
+          <w:p>
+            <w:pPr>
+              <w:bidi/>
+              <w:jc w:val="right"/>
+            </w:pPr>
+            <w:r>
+              <w:rPr>
+                <w:sz w:val="21"/>
+                <w:rtl/>
+                <w:rFonts w:ascii="Tahoma" w:hAnsi="Tahoma" w:cs="Tahoma" w:eastAsia="Tahoma"/>
+                <w:szCs w:val="21"/>
+              </w:rPr>
+              <w:t>مستحق للطرف (نحن مدينون له)</w:t>
+            </w:r>
+          </w:p>
+        </w:tc>
+        <w:tc>
+          <w:tcPr>
+            <w:tcW w:type="dxa" w:w="3402"/>
+          </w:tcPr>
+          <w:p>
+            <w:pPr>
+              <w:bidi/>
+              <w:jc w:val="right"/>
+            </w:pPr>
+            <w:r>
+              <w:rPr>
+                <w:sz w:val="21"/>
+                <w:rtl/>
+                <w:rFonts w:ascii="Tahoma" w:hAnsi="Tahoma" w:cs="Tahoma" w:eastAsia="Tahoma"/>
+                <w:szCs w:val="21"/>
+              </w:rPr>
+              <w:t>ما زال له عندنا مبلغ</w:t>
+            </w:r>
+          </w:p>
+        </w:tc>
+        <w:tc>
+          <w:tcPr>
+            <w:tcW w:type="dxa" w:w="3118"/>
+          </w:tcPr>
+          <w:p>
+            <w:pPr>
+              <w:bidi/>
+              <w:jc w:val="right"/>
+            </w:pPr>
+            <w:r>
+              <w:rPr>
+                <w:sz w:val="21"/>
+                <w:rtl/>
+                <w:rFonts w:ascii="Tahoma" w:hAnsi="Tahoma" w:cs="Tahoma" w:eastAsia="Tahoma"/>
+                <w:szCs w:val="21"/>
+              </w:rPr>
+              <w:t>سطر مدين: يزيد ما يستحقه</w:t>
+            </w:r>
+          </w:p>
+        </w:tc>
+      </w:tr>
+      <w:tr>
+        <w:tc>
+          <w:tcPr>
+            <w:tcW w:type="dxa" w:w="3118"/>
+          </w:tcPr>
+          <w:p>
+            <w:pPr>
+              <w:bidi/>
+              <w:jc w:val="right"/>
+            </w:pPr>
+            <w:r>
+              <w:rPr>
+                <w:sz w:val="21"/>
+                <w:rtl/>
+                <w:rFonts w:ascii="Tahoma" w:hAnsi="Tahoma" w:cs="Tahoma" w:eastAsia="Tahoma"/>
+                <w:szCs w:val="21"/>
+              </w:rPr>
+              <w:t>مستحق علينا (هو مدين لنا)</w:t>
+            </w:r>
+          </w:p>
+        </w:tc>
+        <w:tc>
+          <w:tcPr>
+            <w:tcW w:type="dxa" w:w="3402"/>
+          </w:tcPr>
+          <w:p>
+            <w:pPr>
+              <w:bidi/>
+              <w:jc w:val="right"/>
+            </w:pPr>
+            <w:r>
+              <w:rPr>
+                <w:sz w:val="21"/>
+                <w:rtl/>
+                <w:rFonts w:ascii="Tahoma" w:hAnsi="Tahoma" w:cs="Tahoma" w:eastAsia="Tahoma"/>
+                <w:szCs w:val="21"/>
+              </w:rPr>
+              <w:t>أخذ أكثر من حقه أو عليه مبلغ لنا</w:t>
+            </w:r>
+          </w:p>
+        </w:tc>
+        <w:tc>
+          <w:tcPr>
+            <w:tcW w:type="dxa" w:w="3118"/>
+          </w:tcPr>
+          <w:p>
+            <w:pPr>
+              <w:bidi/>
+              <w:jc w:val="right"/>
+            </w:pPr>
+            <w:r>
+              <w:rPr>
+                <w:sz w:val="21"/>
+                <w:rtl/>
+                <w:rFonts w:ascii="Tahoma" w:hAnsi="Tahoma" w:cs="Tahoma" w:eastAsia="Tahoma"/>
+                <w:szCs w:val="21"/>
+              </w:rPr>
+              <w:t>سطر دائن: يُنقص ما يستحقه</w:t>
+            </w:r>
+          </w:p>
+        </w:tc>
+      </w:tr>
+    </w:tbl>
+    <w:p>
+      <w:pPr>
+        <w:spacing w:after="40"/>
+      </w:pPr>
+    </w:p>
+    <w:p>
+      <w:pPr>
+        <w:keepNext/>
+        <w:bidi/>
+        <w:spacing w:after="80" w:before="160"/>
+        <w:jc w:val="right"/>
+      </w:pPr>
+      <w:r>
+        <w:rPr>
+          <w:b/>
+          <w:color w:val="29595E"/>
+          <w:sz w:val="26"/>
+          <w:rtl/>
+          <w:rFonts w:ascii="Tahoma" w:hAnsi="Tahoma" w:cs="Tahoma" w:eastAsia="Tahoma"/>
+          <w:szCs w:val="26"/>
+          <w:bCs/>
+        </w:rPr>
+        <w:t>الطريقة الأسرع: كل الأرصدة في صفحة واحدة</w:t>
+      </w:r>
+    </w:p>
+    <w:p>
+      <w:pPr>
+        <w:bidi/>
+        <w:spacing w:after="60"/>
+        <w:ind w:right="227"/>
+        <w:jc w:val="right"/>
+      </w:pPr>
+      <w:r>
+        <w:rPr>
+          <w:b w:val="0"/>
+          <w:sz w:val="22"/>
+          <w:rtl/>
+          <w:rFonts w:ascii="Tahoma" w:hAnsi="Tahoma" w:cs="Tahoma" w:eastAsia="Tahoma"/>
+          <w:szCs w:val="22"/>
+        </w:rPr>
+        <w:t>1.  من القائمة (قسم الإعدادات) اضغط «أرصدة الافتتاح».</w:t>
+      </w:r>
+    </w:p>
+    <w:p>
+      <w:pPr>
+        <w:bidi/>
+        <w:spacing w:after="60"/>
+        <w:ind w:right="227"/>
+        <w:jc w:val="right"/>
+      </w:pPr>
+      <w:r>
+        <w:rPr>
+          <w:b w:val="0"/>
+          <w:sz w:val="22"/>
+          <w:rtl/>
+          <w:rFonts w:ascii="Tahoma" w:hAnsi="Tahoma" w:cs="Tahoma" w:eastAsia="Tahoma"/>
+          <w:szCs w:val="22"/>
+        </w:rPr>
+        <w:t>2.  اكتب تاريخ الافتتاح: يوم بدء العمل الفعلي بالنظام (رصيد كما في هذا التاريخ).</w:t>
+      </w:r>
+    </w:p>
+    <w:p>
+      <w:pPr>
+        <w:bidi/>
+        <w:spacing w:after="60"/>
+        <w:ind w:right="227"/>
+        <w:jc w:val="right"/>
+      </w:pPr>
+      <w:r>
+        <w:rPr>
+          <w:b w:val="0"/>
+          <w:sz w:val="22"/>
+          <w:rtl/>
+          <w:rFonts w:ascii="Tahoma" w:hAnsi="Tahoma" w:cs="Tahoma" w:eastAsia="Tahoma"/>
+          <w:szCs w:val="22"/>
+        </w:rPr>
+        <w:t>3.  أمام كل مقاول ومورد اكتب المبلغ واختر الاتجاه. اترك الفارغ لمن لا رصيد له.</w:t>
+      </w:r>
+    </w:p>
+    <w:p>
+      <w:pPr>
+        <w:bidi/>
+        <w:spacing w:after="60"/>
+        <w:ind w:right="227"/>
+        <w:jc w:val="right"/>
+      </w:pPr>
+      <w:r>
+        <w:rPr>
+          <w:b w:val="0"/>
+          <w:sz w:val="22"/>
+          <w:rtl/>
+          <w:rFonts w:ascii="Tahoma" w:hAnsi="Tahoma" w:cs="Tahoma" w:eastAsia="Tahoma"/>
+          <w:szCs w:val="22"/>
+        </w:rPr>
+        <w:t>4.  اضغط «حفظ الأرصدة». يمكنك تعديل أي رصيد لاحقاً من نفس الصفحة أو من صفحة المقاول / المورد.</w:t>
+      </w:r>
+    </w:p>
+    <w:p>
+      <w:pPr>
+        <w:keepNext/>
+        <w:bidi/>
+        <w:spacing w:after="80" w:before="160"/>
+        <w:jc w:val="right"/>
+      </w:pPr>
+      <w:r>
+        <w:rPr>
+          <w:b/>
+          <w:color w:val="29595E"/>
+          <w:sz w:val="26"/>
+          <w:rtl/>
+          <w:rFonts w:ascii="Tahoma" w:hAnsi="Tahoma" w:cs="Tahoma" w:eastAsia="Tahoma"/>
+          <w:szCs w:val="26"/>
+          <w:bCs/>
+        </w:rPr>
+        <w:t>رصيد طرف واحد</w:t>
+      </w:r>
+    </w:p>
+    <w:p>
+      <w:pPr>
+        <w:bidi/>
+        <w:spacing w:after="60"/>
+        <w:ind w:right="227"/>
+        <w:jc w:val="right"/>
+      </w:pPr>
+      <w:r>
+        <w:rPr>
+          <w:b w:val="0"/>
+          <w:sz w:val="22"/>
+          <w:rtl/>
+          <w:rFonts w:ascii="Tahoma" w:hAnsi="Tahoma" w:cs="Tahoma" w:eastAsia="Tahoma"/>
+          <w:szCs w:val="22"/>
+        </w:rPr>
+        <w:t>•  عند إضافة مقاول أو مورد جديد: في أسفل النموذج خانة «رصيد الافتتاح (اختياري)».</w:t>
+      </w:r>
+    </w:p>
+    <w:p>
+      <w:pPr>
+        <w:bidi/>
+        <w:spacing w:after="60"/>
+        <w:ind w:right="227"/>
+        <w:jc w:val="right"/>
+      </w:pPr>
+      <w:r>
+        <w:rPr>
+          <w:b w:val="0"/>
+          <w:sz w:val="22"/>
+          <w:rtl/>
+          <w:rFonts w:ascii="Tahoma" w:hAnsi="Tahoma" w:cs="Tahoma" w:eastAsia="Tahoma"/>
+          <w:szCs w:val="22"/>
+        </w:rPr>
+        <w:t>•  لطرف موجود: في صفحة المقاول تبويب «الحركات المالية»، وفي صفحة المورد تبويب «الحساب»، بطاقة «رصيد الافتتاح» في أعلاه.</w:t>
+      </w:r>
+    </w:p>
+    <w:p>
+      <w:pPr>
+        <w:bidi/>
+        <w:spacing w:after="60"/>
+        <w:ind w:right="227"/>
+        <w:jc w:val="right"/>
+      </w:pPr>
+      <w:r>
+        <w:rPr>
+          <w:b w:val="0"/>
+          <w:sz w:val="22"/>
+          <w:rtl/>
+          <w:rFonts w:ascii="Tahoma" w:hAnsi="Tahoma" w:cs="Tahoma" w:eastAsia="Tahoma"/>
+          <w:szCs w:val="22"/>
+        </w:rPr>
+        <w:t>•  «إلغاء الرصيد الافتتاحي» يحذفه من الكشف.</w:t>
+      </w:r>
+    </w:p>
+    <w:tbl>
+      <w:tblPr>
+        <w:tblW w:type="auto" w:w="0"/>
+        <w:jc w:val="center"/>
+        <w:tblLook w:firstColumn="1" w:firstRow="1" w:lastColumn="0" w:lastRow="0" w:noHBand="0" w:noVBand="1" w:val="04A0"/>
+        <w:bidiVisual/>
+      </w:tblPr>
+      <w:tblGrid>
+        <w:gridCol w:w="9972"/>
+      </w:tblGrid>
+      <w:tr>
+        <w:tc>
+          <w:tcPr>
+            <w:tcW w:type="dxa" w:w="9972"/>
+            <w:shd w:val="clear" w:color="auto" w:fill="FEF3C7"/>
+          </w:tcPr>
+          <w:p>
+            <w:pPr>
+              <w:bidi/>
+              <w:jc w:val="right"/>
+            </w:pPr>
+            <w:r>
+              <w:rPr>
+                <w:b/>
+                <w:sz w:val="21"/>
+                <w:rtl/>
+                <w:rFonts w:ascii="Tahoma" w:hAnsi="Tahoma" w:cs="Tahoma" w:eastAsia="Tahoma"/>
+                <w:szCs w:val="21"/>
+                <w:bCs/>
+              </w:rPr>
+              <w:t xml:space="preserve">انتبه: </w:t>
+            </w:r>
+            <w:r>
+              <w:rPr>
+                <w:sz w:val="21"/>
+                <w:rtl/>
+                <w:rFonts w:ascii="Tahoma" w:hAnsi="Tahoma" w:cs="Tahoma" w:eastAsia="Tahoma"/>
+                <w:szCs w:val="21"/>
+              </w:rPr>
+              <w:t>أي مستخلص أو حركة أو أمر شراء تاريخه قبل تاريخ الافتتاح مشمول في الرصيد، فيرفض النظام إدخاله ثانية حتى لا يُحسب المبلغ مرتين. إن كان تاريخ الافتتاح غير مناسب فعدّله أولاً.</w:t>
+            </w:r>
+          </w:p>
+        </w:tc>
+      </w:tr>
+    </w:tbl>
+    <w:p>
+      <w:pPr>
+        <w:spacing w:after="40"/>
+      </w:pPr>
+    </w:p>
+    <w:tbl>
+      <w:tblPr>
+        <w:tblW w:type="auto" w:w="0"/>
+        <w:jc w:val="center"/>
+        <w:tblLook w:firstColumn="1" w:firstRow="1" w:lastColumn="0" w:lastRow="0" w:noHBand="0" w:noVBand="1" w:val="04A0"/>
+        <w:bidiVisual/>
+      </w:tblPr>
+      <w:tblGrid>
+        <w:gridCol w:w="9972"/>
+      </w:tblGrid>
+      <w:tr>
+        <w:tc>
+          <w:tcPr>
+            <w:tcW w:type="dxa" w:w="9972"/>
+            <w:shd w:val="clear" w:color="auto" w:fill="E6EFF0"/>
+          </w:tcPr>
+          <w:p>
+            <w:pPr>
+              <w:bidi/>
+              <w:jc w:val="right"/>
+            </w:pPr>
+            <w:r>
+              <w:rPr>
+                <w:b/>
+                <w:sz w:val="21"/>
+                <w:rtl/>
+                <w:rFonts w:ascii="Tahoma" w:hAnsi="Tahoma" w:cs="Tahoma" w:eastAsia="Tahoma"/>
+                <w:szCs w:val="21"/>
+                <w:bCs/>
+              </w:rPr>
+              <w:t xml:space="preserve">ملاحظة: </w:t>
+            </w:r>
+            <w:r>
+              <w:rPr>
+                <w:sz w:val="21"/>
+                <w:rtl/>
+                <w:rFonts w:ascii="Tahoma" w:hAnsi="Tahoma" w:cs="Tahoma" w:eastAsia="Tahoma"/>
+                <w:szCs w:val="21"/>
+              </w:rPr>
+              <w:t>رصيد الافتتاح يدخل تلقائياً في كشف الحساب وفي أرقام صفحة المقاول والرئيسية، فلا تختلف الأرقام بين الشاشات.</w:t>
+            </w:r>
+          </w:p>
+        </w:tc>
+      </w:tr>
+    </w:tbl>
+    <w:p>
+      <w:pPr>
+        <w:spacing w:after="40"/>
+      </w:pPr>
+    </w:p>
+    <w:p>
+      <w:pPr>
+        <w:keepNext/>
+        <w:bidi/>
+        <w:spacing w:after="160" w:before="280"/>
+        <w:jc w:val="right"/>
+      </w:pPr>
+      <w:r>
+        <w:rPr>
+          <w:b/>
+          <w:color w:val="29595E"/>
+          <w:sz w:val="36"/>
+          <w:rtl/>
+          <w:rFonts w:ascii="Tahoma" w:hAnsi="Tahoma" w:cs="Tahoma" w:eastAsia="Tahoma"/>
+          <w:szCs w:val="36"/>
+          <w:bCs/>
+        </w:rPr>
+        <w:t>8. كشف حساب المورد</w:t>
+      </w:r>
+    </w:p>
+    <w:p>
+      <w:pPr>
+        <w:bidi/>
+        <w:spacing w:after="120"/>
+        <w:jc w:val="right"/>
+      </w:pPr>
+      <w:r>
+        <w:rPr>
+          <w:b w:val="0"/>
+          <w:sz w:val="22"/>
+          <w:rtl/>
+          <w:rFonts w:ascii="Tahoma" w:hAnsi="Tahoma" w:cs="Tahoma" w:eastAsia="Tahoma"/>
+          <w:szCs w:val="22"/>
+        </w:rPr>
+        <w:t>يشبه كشف حساب المقاول تماماً. افتحه من صفحة المورد: زر «كشف الحساب»، أو تبويب «الحساب» ← «كشف الحساب الكامل».</w:t>
+      </w:r>
+    </w:p>
+    <w:p>
+      <w:pPr>
+        <w:bidi/>
+        <w:spacing w:after="60"/>
+        <w:ind w:right="227"/>
+        <w:jc w:val="right"/>
+      </w:pPr>
+      <w:r>
+        <w:rPr>
+          <w:b w:val="0"/>
+          <w:sz w:val="22"/>
+          <w:rtl/>
+          <w:rFonts w:ascii="Tahoma" w:hAnsi="Tahoma" w:cs="Tahoma" w:eastAsia="Tahoma"/>
+          <w:szCs w:val="22"/>
+        </w:rPr>
+        <w:t>•  مدين = ما يستحقه المورد (أوامر الشراء + أي استحقاق آخر). دائن = ما دُفع له أو خُصم (دفعات، مرتجعات، خصومات).</w:t>
+      </w:r>
+    </w:p>
+    <w:p>
+      <w:pPr>
+        <w:bidi/>
+        <w:spacing w:after="60"/>
+        <w:ind w:right="227"/>
+        <w:jc w:val="right"/>
+      </w:pPr>
+      <w:r>
+        <w:rPr>
+          <w:b w:val="0"/>
+          <w:sz w:val="22"/>
+          <w:rtl/>
+          <w:rFonts w:ascii="Tahoma" w:hAnsi="Tahoma" w:cs="Tahoma" w:eastAsia="Tahoma"/>
+          <w:szCs w:val="22"/>
+        </w:rPr>
+        <w:t>•  البطاقات: رصيد الافتتاح · إجمالي المشتريات · المسدَّد والمخصوم · الرصيد الحالي.</w:t>
+      </w:r>
+    </w:p>
+    <w:p>
+      <w:pPr>
+        <w:bidi/>
+        <w:spacing w:after="60"/>
+        <w:ind w:right="227"/>
+        <w:jc w:val="right"/>
+      </w:pPr>
+      <w:r>
+        <w:rPr>
+          <w:b w:val="0"/>
+          <w:sz w:val="22"/>
+          <w:rtl/>
+          <w:rFonts w:ascii="Tahoma" w:hAnsi="Tahoma" w:cs="Tahoma" w:eastAsia="Tahoma"/>
+          <w:szCs w:val="22"/>
+        </w:rPr>
+        <w:t>•  الفلاتر: من تاريخ، إلى تاريخ، المشروع، وطريقة احتساب المشتريات (كل أوامر الشراء، أو الفواتير الصادرة فقط). ما قبل «من تاريخ» يظهر سطراً واحداً اسمه «رصيد سابق».</w:t>
+      </w:r>
+    </w:p>
+    <w:p>
+      <w:pPr>
+        <w:bidi/>
+        <w:spacing w:after="60"/>
+        <w:ind w:right="227"/>
+        <w:jc w:val="right"/>
+      </w:pPr>
+      <w:r>
+        <w:rPr>
+          <w:b w:val="0"/>
+          <w:sz w:val="22"/>
+          <w:rtl/>
+          <w:rFonts w:ascii="Tahoma" w:hAnsi="Tahoma" w:cs="Tahoma" w:eastAsia="Tahoma"/>
+          <w:szCs w:val="22"/>
+        </w:rPr>
+        <w:t>•  أمر الشراء المعلَّم «تم السداد» يُحتسب مسدَّداً بكامل قيمته في تاريخ السداد.</w:t>
+      </w:r>
+    </w:p>
+    <w:p>
+      <w:pPr>
+        <w:bidi/>
+        <w:spacing w:after="60"/>
+        <w:ind w:right="227"/>
+        <w:jc w:val="right"/>
+      </w:pPr>
+      <w:r>
+        <w:rPr>
+          <w:b w:val="0"/>
+          <w:sz w:val="22"/>
+          <w:rtl/>
+          <w:rFonts w:ascii="Tahoma" w:hAnsi="Tahoma" w:cs="Tahoma" w:eastAsia="Tahoma"/>
+          <w:szCs w:val="22"/>
+        </w:rPr>
+        <w:t>•  يمكن الطباعة وتصدير PDF.</w:t>
+      </w:r>
+    </w:p>
+    <w:p>
+      <w:pPr>
+        <w:keepNext/>
+        <w:bidi/>
+        <w:spacing w:after="80" w:before="160"/>
+        <w:jc w:val="right"/>
+      </w:pPr>
+      <w:r>
+        <w:rPr>
+          <w:b/>
+          <w:color w:val="29595E"/>
+          <w:sz w:val="26"/>
+          <w:rtl/>
+          <w:rFonts w:ascii="Tahoma" w:hAnsi="Tahoma" w:cs="Tahoma" w:eastAsia="Tahoma"/>
+          <w:szCs w:val="26"/>
+          <w:bCs/>
+        </w:rPr>
+        <w:t>تسجيل دفعة أو حركة على المورد</w:t>
+      </w:r>
+    </w:p>
+    <w:p>
+      <w:pPr>
+        <w:bidi/>
+        <w:spacing w:after="60"/>
+        <w:ind w:right="227"/>
+        <w:jc w:val="right"/>
+      </w:pPr>
+      <w:r>
+        <w:rPr>
+          <w:b w:val="0"/>
+          <w:sz w:val="22"/>
+          <w:rtl/>
+          <w:rFonts w:ascii="Tahoma" w:hAnsi="Tahoma" w:cs="Tahoma" w:eastAsia="Tahoma"/>
+          <w:szCs w:val="22"/>
+        </w:rPr>
+        <w:t>1.  صفحة المورد ← تبويب «الحساب» ← «+ إضافة حركة».</w:t>
+      </w:r>
+    </w:p>
+    <w:p>
+      <w:pPr>
+        <w:bidi/>
+        <w:spacing w:after="60"/>
+        <w:ind w:right="227"/>
+        <w:jc w:val="right"/>
+      </w:pPr>
+      <w:r>
+        <w:rPr>
+          <w:b w:val="0"/>
+          <w:sz w:val="22"/>
+          <w:rtl/>
+          <w:rFonts w:ascii="Tahoma" w:hAnsi="Tahoma" w:cs="Tahoma" w:eastAsia="Tahoma"/>
+          <w:szCs w:val="22"/>
+        </w:rPr>
+        <w:t>2.  اختر النوع: دائن (دفعة، مرتجع / إشعار دائن، خصم، تسوية) أو مدين (استحقاق آخر، رد دفعة).</w:t>
+      </w:r>
+    </w:p>
+    <w:p>
+      <w:pPr>
+        <w:bidi/>
+        <w:spacing w:after="60"/>
+        <w:ind w:right="227"/>
+        <w:jc w:val="right"/>
+      </w:pPr>
+      <w:r>
+        <w:rPr>
+          <w:b w:val="0"/>
+          <w:sz w:val="22"/>
+          <w:rtl/>
+          <w:rFonts w:ascii="Tahoma" w:hAnsi="Tahoma" w:cs="Tahoma" w:eastAsia="Tahoma"/>
+          <w:szCs w:val="22"/>
+        </w:rPr>
+        <w:t>3.  اكتب الوصف والمبلغ والتاريخ، ويمكنك ربط الحركة بمشروع وبأمر شراء، ثم احفظ.</w:t>
+      </w:r>
+    </w:p>
+    <w:tbl>
+      <w:tblPr>
+        <w:tblW w:type="auto" w:w="0"/>
+        <w:jc w:val="center"/>
+        <w:tblLook w:firstColumn="1" w:firstRow="1" w:lastColumn="0" w:lastRow="0" w:noHBand="0" w:noVBand="1" w:val="04A0"/>
+        <w:bidiVisual/>
+      </w:tblPr>
+      <w:tblGrid>
+        <w:gridCol w:w="9972"/>
+      </w:tblGrid>
+      <w:tr>
+        <w:tc>
+          <w:tcPr>
+            <w:tcW w:type="dxa" w:w="9972"/>
+            <w:shd w:val="clear" w:color="auto" w:fill="FEF3C7"/>
+          </w:tcPr>
+          <w:p>
+            <w:pPr>
+              <w:bidi/>
+              <w:jc w:val="right"/>
+            </w:pPr>
+            <w:r>
+              <w:rPr>
+                <w:b/>
+                <w:sz w:val="21"/>
+                <w:rtl/>
+                <w:rFonts w:ascii="Tahoma" w:hAnsi="Tahoma" w:cs="Tahoma" w:eastAsia="Tahoma"/>
+                <w:szCs w:val="21"/>
+                <w:bCs/>
+              </w:rPr>
+              <w:t xml:space="preserve">انتبه: </w:t>
+            </w:r>
+            <w:r>
+              <w:rPr>
+                <w:sz w:val="21"/>
+                <w:rtl/>
+                <w:rFonts w:ascii="Tahoma" w:hAnsi="Tahoma" w:cs="Tahoma" w:eastAsia="Tahoma"/>
+                <w:szCs w:val="21"/>
+              </w:rPr>
+              <w:t>إن سجّلت دفعة جزئية وربطتها بأمر شراء معلَّم «تم السداد» فتُحتسب بمبلغها الفعلي بدل احتساب الأمر مسدداً بالكامل. هكذا لا يُحسب الدفع مرتين.</w:t>
+            </w:r>
+          </w:p>
+        </w:tc>
+      </w:tr>
+    </w:tbl>
+    <w:p>
+      <w:pPr>
+        <w:spacing w:after="40"/>
+      </w:pPr>
+    </w:p>
+    <w:p>
+      <w:pPr>
+        <w:keepNext/>
+        <w:bidi/>
+        <w:spacing w:after="160" w:before="280"/>
+        <w:jc w:val="right"/>
+      </w:pPr>
+      <w:r>
+        <w:rPr>
+          <w:b/>
+          <w:color w:val="29595E"/>
+          <w:sz w:val="36"/>
+          <w:rtl/>
+          <w:rFonts w:ascii="Tahoma" w:hAnsi="Tahoma" w:cs="Tahoma" w:eastAsia="Tahoma"/>
+          <w:szCs w:val="36"/>
+          <w:bCs/>
+        </w:rPr>
+        <w:t>9. الطباعة: أمر الصرف العام</w:t>
+      </w:r>
+    </w:p>
+    <w:p>
+      <w:pPr>
+        <w:bidi/>
+        <w:spacing w:after="120"/>
+        <w:jc w:val="right"/>
+      </w:pPr>
+      <w:r>
+        <w:rPr>
+          <w:b w:val="0"/>
+          <w:sz w:val="22"/>
+          <w:rtl/>
+          <w:rFonts w:ascii="Tahoma" w:hAnsi="Tahoma" w:cs="Tahoma" w:eastAsia="Tahoma"/>
+          <w:szCs w:val="22"/>
+        </w:rPr>
+        <w:t>قسم «الطباعة» في القائمة الجانبية يطبع «طلب صرف» على نموذج الشركة من بيانات المشروع والمورد أو المقاول.</w:t>
+      </w:r>
+    </w:p>
+    <w:p>
+      <w:pPr>
+        <w:keepNext/>
+        <w:bidi/>
+        <w:spacing w:after="80" w:before="160"/>
+        <w:jc w:val="right"/>
+      </w:pPr>
+      <w:r>
+        <w:rPr>
+          <w:b/>
+          <w:color w:val="29595E"/>
+          <w:sz w:val="26"/>
+          <w:rtl/>
+          <w:rFonts w:ascii="Tahoma" w:hAnsi="Tahoma" w:cs="Tahoma" w:eastAsia="Tahoma"/>
+          <w:szCs w:val="26"/>
+          <w:bCs/>
+        </w:rPr>
+        <w:t>إنشاء أمر صرف عام</w:t>
+      </w:r>
+    </w:p>
+    <w:p>
+      <w:pPr>
+        <w:bidi/>
+        <w:spacing w:after="60"/>
+        <w:ind w:right="227"/>
+        <w:jc w:val="right"/>
+      </w:pPr>
+      <w:r>
+        <w:rPr>
+          <w:b w:val="0"/>
+          <w:sz w:val="22"/>
+          <w:rtl/>
+          <w:rFonts w:ascii="Tahoma" w:hAnsi="Tahoma" w:cs="Tahoma" w:eastAsia="Tahoma"/>
+          <w:szCs w:val="22"/>
+        </w:rPr>
+        <w:t>1.  من القائمة: «الطباعة» ← «أوامر الصرف العامة» ← زر «إنشاء أمر صرف عام».</w:t>
+      </w:r>
+    </w:p>
+    <w:p>
+      <w:pPr>
+        <w:bidi/>
+        <w:spacing w:after="60"/>
+        <w:ind w:right="227"/>
+        <w:jc w:val="right"/>
+      </w:pPr>
+      <w:r>
+        <w:rPr>
+          <w:b w:val="0"/>
+          <w:sz w:val="22"/>
+          <w:rtl/>
+          <w:rFonts w:ascii="Tahoma" w:hAnsi="Tahoma" w:cs="Tahoma" w:eastAsia="Tahoma"/>
+          <w:szCs w:val="22"/>
+        </w:rPr>
+        <w:t>2.  اختر اسم المشروع. ثم اختر هل المستفيد مورد أم مقاول، ثم اختر اسمه من القائمة (المرتبطون بالمشروع يظهرون أولاً).</w:t>
+      </w:r>
+    </w:p>
+    <w:p>
+      <w:pPr>
+        <w:bidi/>
+        <w:spacing w:after="60"/>
+        <w:ind w:right="227"/>
+        <w:jc w:val="right"/>
+      </w:pPr>
+      <w:r>
+        <w:rPr>
+          <w:b w:val="0"/>
+          <w:sz w:val="22"/>
+          <w:rtl/>
+          <w:rFonts w:ascii="Tahoma" w:hAnsi="Tahoma" w:cs="Tahoma" w:eastAsia="Tahoma"/>
+          <w:szCs w:val="22"/>
+        </w:rPr>
+        <w:t>3.  يظهر مربع بمستندات هذا المستفيد المستحقة على المشروع (مستخلصات المقاول أو أوامر شراء المورد). علّم ما تريد صرفه: يُضاف كبند وكمستند مرجعي تلقائياً بمبلغه.</w:t>
+      </w:r>
+    </w:p>
+    <w:p>
+      <w:pPr>
+        <w:bidi/>
+        <w:spacing w:after="60"/>
+        <w:ind w:right="227"/>
+        <w:jc w:val="right"/>
+      </w:pPr>
+      <w:r>
+        <w:rPr>
+          <w:b w:val="0"/>
+          <w:sz w:val="22"/>
+          <w:rtl/>
+          <w:rFonts w:ascii="Tahoma" w:hAnsi="Tahoma" w:cs="Tahoma" w:eastAsia="Tahoma"/>
+          <w:szCs w:val="22"/>
+        </w:rPr>
+        <w:t>4.  أكمل: نوع الطلب، القسم الطالب، مركز التكلفة (افتراضياً اسم المشروع)، طريقة السداد، بيان السداد، والبيان. يمكنك إضافة بنود ومستندات مرجعية يدوياً.</w:t>
+      </w:r>
+    </w:p>
+    <w:p>
+      <w:pPr>
+        <w:bidi/>
+        <w:spacing w:after="60"/>
+        <w:ind w:right="227"/>
+        <w:jc w:val="right"/>
+      </w:pPr>
+      <w:r>
+        <w:rPr>
+          <w:b w:val="0"/>
+          <w:sz w:val="22"/>
+          <w:rtl/>
+          <w:rFonts w:ascii="Tahoma" w:hAnsi="Tahoma" w:cs="Tahoma" w:eastAsia="Tahoma"/>
+          <w:szCs w:val="22"/>
+        </w:rPr>
+        <w:t>5.  اختر هل الأسعار شاملة الضريبة أم لا، وأضف خصماً إن وُجد (يُحسب بعد الضريبة). تظهر الإجماليات فوراً أسفل البنود.</w:t>
+      </w:r>
+    </w:p>
+    <w:p>
+      <w:pPr>
+        <w:bidi/>
+        <w:spacing w:after="60"/>
+        <w:ind w:right="227"/>
+        <w:jc w:val="right"/>
+      </w:pPr>
+      <w:r>
+        <w:rPr>
+          <w:b w:val="0"/>
+          <w:sz w:val="22"/>
+          <w:rtl/>
+          <w:rFonts w:ascii="Tahoma" w:hAnsi="Tahoma" w:cs="Tahoma" w:eastAsia="Tahoma"/>
+          <w:szCs w:val="22"/>
+        </w:rPr>
+        <w:t>6.  اضغط «حفظ كمسودة». يُعطى الأمر رقماً تلقائياً (PR-0027 مثلاً).</w:t>
+      </w:r>
+    </w:p>
+    <w:p>
+      <w:pPr>
+        <w:keepNext/>
+        <w:bidi/>
+        <w:spacing w:after="80" w:before="160"/>
+        <w:jc w:val="right"/>
+      </w:pPr>
+      <w:r>
+        <w:rPr>
+          <w:b/>
+          <w:color w:val="29595E"/>
+          <w:sz w:val="26"/>
+          <w:rtl/>
+          <w:rFonts w:ascii="Tahoma" w:hAnsi="Tahoma" w:cs="Tahoma" w:eastAsia="Tahoma"/>
+          <w:szCs w:val="26"/>
+          <w:bCs/>
+        </w:rPr>
+        <w:t>بعد الحفظ</w:t>
+      </w:r>
+    </w:p>
+    <w:tbl>
+      <w:tblPr>
+        <w:tblStyle w:val="TableGrid"/>
+        <w:tblW w:type="auto" w:w="0"/>
+        <w:jc w:val="center"/>
+        <w:tblLayout w:type="fixed"/>
+        <w:tblLook w:firstColumn="1" w:firstRow="1" w:lastColumn="0" w:lastRow="0" w:noHBand="0" w:noVBand="1" w:val="04A0"/>
+        <w:bidiVisual/>
+        <w:tblLayout w:type="fixed"/>
+      </w:tblPr>
+      <w:tblGrid>
+        <w:gridCol w:w="2268"/>
+        <w:gridCol w:w="7370"/>
+      </w:tblGrid>
+      <w:tr>
+        <w:tc>
+          <w:tcPr>
+            <w:tcW w:type="dxa" w:w="2268"/>
+            <w:shd w:val="clear" w:color="auto" w:fill="29595E"/>
+          </w:tcPr>
+          <w:p>
+            <w:pPr>
+              <w:bidi/>
+              <w:jc w:val="right"/>
+            </w:pPr>
+            <w:r>
+              <w:rPr>
+                <w:b/>
+                <w:color w:val="FFFFFF"/>
+                <w:sz w:val="21"/>
+                <w:rtl/>
+                <w:rFonts w:ascii="Tahoma" w:hAnsi="Tahoma" w:cs="Tahoma" w:eastAsia="Tahoma"/>
+                <w:szCs w:val="21"/>
+                <w:bCs/>
+              </w:rPr>
+              <w:t>الزر</w:t>
+            </w:r>
+          </w:p>
+        </w:tc>
+        <w:tc>
+          <w:tcPr>
+            <w:tcW w:type="dxa" w:w="7370"/>
+            <w:shd w:val="clear" w:color="auto" w:fill="29595E"/>
+          </w:tcPr>
+          <w:p>
+            <w:pPr>
+              <w:bidi/>
+              <w:jc w:val="right"/>
+            </w:pPr>
+            <w:r>
+              <w:rPr>
+                <w:b/>
+                <w:color w:val="FFFFFF"/>
+                <w:sz w:val="21"/>
+                <w:rtl/>
+                <w:rFonts w:ascii="Tahoma" w:hAnsi="Tahoma" w:cs="Tahoma" w:eastAsia="Tahoma"/>
+                <w:szCs w:val="21"/>
+                <w:bCs/>
+              </w:rPr>
+              <w:t>ماذا يفعل</w:t>
+            </w:r>
+          </w:p>
+        </w:tc>
+      </w:tr>
+      <w:tr>
+        <w:tc>
+          <w:tcPr>
+            <w:tcW w:type="dxa" w:w="2268"/>
+          </w:tcPr>
+          <w:p>
+            <w:pPr>
+              <w:bidi/>
+              <w:jc w:val="right"/>
+            </w:pPr>
+            <w:r>
+              <w:rPr>
+                <w:sz w:val="21"/>
+                <w:rtl/>
+                <w:rFonts w:ascii="Tahoma" w:hAnsi="Tahoma" w:cs="Tahoma" w:eastAsia="Tahoma"/>
+                <w:szCs w:val="21"/>
+              </w:rPr>
+              <w:t>طباعة</w:t>
+            </w:r>
+          </w:p>
+        </w:tc>
+        <w:tc>
+          <w:tcPr>
+            <w:tcW w:type="dxa" w:w="7370"/>
+          </w:tcPr>
+          <w:p>
+            <w:pPr>
+              <w:bidi/>
+              <w:jc w:val="right"/>
+            </w:pPr>
+            <w:r>
+              <w:rPr>
+                <w:sz w:val="21"/>
+                <w:rtl/>
+                <w:rFonts w:ascii="Tahoma" w:hAnsi="Tahoma" w:cs="Tahoma" w:eastAsia="Tahoma"/>
+                <w:szCs w:val="21"/>
+              </w:rPr>
+              <w:t>يفتح النموذج للطباعة على A4، أو الحفظ كـ PDF من المتصفح.</w:t>
+            </w:r>
+          </w:p>
+        </w:tc>
+      </w:tr>
+      <w:tr>
+        <w:tc>
+          <w:tcPr>
+            <w:tcW w:type="dxa" w:w="2268"/>
+          </w:tcPr>
+          <w:p>
+            <w:pPr>
+              <w:bidi/>
+              <w:jc w:val="right"/>
+            </w:pPr>
+            <w:r>
+              <w:rPr>
+                <w:sz w:val="21"/>
+                <w:rtl/>
+                <w:rFonts w:ascii="Tahoma" w:hAnsi="Tahoma" w:cs="Tahoma" w:eastAsia="Tahoma"/>
+                <w:szCs w:val="21"/>
+              </w:rPr>
+              <w:t>تصدير PDF</w:t>
+            </w:r>
+          </w:p>
+        </w:tc>
+        <w:tc>
+          <w:tcPr>
+            <w:tcW w:type="dxa" w:w="7370"/>
+          </w:tcPr>
+          <w:p>
+            <w:pPr>
+              <w:bidi/>
+              <w:jc w:val="right"/>
+            </w:pPr>
+            <w:r>
+              <w:rPr>
+                <w:sz w:val="21"/>
+                <w:rtl/>
+                <w:rFonts w:ascii="Tahoma" w:hAnsi="Tahoma" w:cs="Tahoma" w:eastAsia="Tahoma"/>
+                <w:szCs w:val="21"/>
+              </w:rPr>
+              <w:t>ينزّل ملف PDF مباشرة.</w:t>
+            </w:r>
+          </w:p>
+        </w:tc>
+      </w:tr>
+      <w:tr>
+        <w:tc>
+          <w:tcPr>
+            <w:tcW w:type="dxa" w:w="2268"/>
+          </w:tcPr>
+          <w:p>
+            <w:pPr>
+              <w:bidi/>
+              <w:jc w:val="right"/>
+            </w:pPr>
+            <w:r>
+              <w:rPr>
+                <w:sz w:val="21"/>
+                <w:rtl/>
+                <w:rFonts w:ascii="Tahoma" w:hAnsi="Tahoma" w:cs="Tahoma" w:eastAsia="Tahoma"/>
+                <w:szCs w:val="21"/>
+              </w:rPr>
+              <w:t>تعديل</w:t>
+            </w:r>
+          </w:p>
+        </w:tc>
+        <w:tc>
+          <w:tcPr>
+            <w:tcW w:type="dxa" w:w="7370"/>
+          </w:tcPr>
+          <w:p>
+            <w:pPr>
+              <w:bidi/>
+              <w:jc w:val="right"/>
+            </w:pPr>
+            <w:r>
+              <w:rPr>
+                <w:sz w:val="21"/>
+                <w:rtl/>
+                <w:rFonts w:ascii="Tahoma" w:hAnsi="Tahoma" w:cs="Tahoma" w:eastAsia="Tahoma"/>
+                <w:szCs w:val="21"/>
+              </w:rPr>
+              <w:t>متاح للمسودة فقط.</w:t>
+            </w:r>
+          </w:p>
+        </w:tc>
+      </w:tr>
+      <w:tr>
+        <w:tc>
+          <w:tcPr>
+            <w:tcW w:type="dxa" w:w="2268"/>
+          </w:tcPr>
+          <w:p>
+            <w:pPr>
+              <w:bidi/>
+              <w:jc w:val="right"/>
+            </w:pPr>
+            <w:r>
+              <w:rPr>
+                <w:sz w:val="21"/>
+                <w:rtl/>
+                <w:rFonts w:ascii="Tahoma" w:hAnsi="Tahoma" w:cs="Tahoma" w:eastAsia="Tahoma"/>
+                <w:szCs w:val="21"/>
+              </w:rPr>
+              <w:t>اعتماد</w:t>
+            </w:r>
+          </w:p>
+        </w:tc>
+        <w:tc>
+          <w:tcPr>
+            <w:tcW w:type="dxa" w:w="7370"/>
+          </w:tcPr>
+          <w:p>
+            <w:pPr>
+              <w:bidi/>
+              <w:jc w:val="right"/>
+            </w:pPr>
+            <w:r>
+              <w:rPr>
+                <w:sz w:val="21"/>
+                <w:rtl/>
+                <w:rFonts w:ascii="Tahoma" w:hAnsi="Tahoma" w:cs="Tahoma" w:eastAsia="Tahoma"/>
+                <w:szCs w:val="21"/>
+              </w:rPr>
+              <w:t>يثبّت الأمر ولا يعود قابلاً للتعديل (لمن عنده صلاحية الاعتماد).</w:t>
+            </w:r>
+          </w:p>
+        </w:tc>
+      </w:tr>
+      <w:tr>
+        <w:tc>
+          <w:tcPr>
+            <w:tcW w:type="dxa" w:w="2268"/>
+          </w:tcPr>
+          <w:p>
+            <w:pPr>
+              <w:bidi/>
+              <w:jc w:val="right"/>
+            </w:pPr>
+            <w:r>
+              <w:rPr>
+                <w:sz w:val="21"/>
+                <w:rtl/>
+                <w:rFonts w:ascii="Tahoma" w:hAnsi="Tahoma" w:cs="Tahoma" w:eastAsia="Tahoma"/>
+                <w:szCs w:val="21"/>
+              </w:rPr>
+              <w:t>إلغاء الأمر</w:t>
+            </w:r>
+          </w:p>
+        </w:tc>
+        <w:tc>
+          <w:tcPr>
+            <w:tcW w:type="dxa" w:w="7370"/>
+          </w:tcPr>
+          <w:p>
+            <w:pPr>
+              <w:bidi/>
+              <w:jc w:val="right"/>
+            </w:pPr>
+            <w:r>
+              <w:rPr>
+                <w:sz w:val="21"/>
+                <w:rtl/>
+                <w:rFonts w:ascii="Tahoma" w:hAnsi="Tahoma" w:cs="Tahoma" w:eastAsia="Tahoma"/>
+                <w:szCs w:val="21"/>
+              </w:rPr>
+              <w:t>يُلغى الأمر ويبقى في السجل بختم «ملغي»؛ لا يُحذف أي أمر أبداً.</w:t>
+            </w:r>
+          </w:p>
+        </w:tc>
+      </w:tr>
+    </w:tbl>
+    <w:p>
+      <w:pPr>
+        <w:spacing w:after="40"/>
+      </w:pPr>
+    </w:p>
+    <w:tbl>
+      <w:tblPr>
+        <w:tblW w:type="auto" w:w="0"/>
+        <w:jc w:val="center"/>
+        <w:tblLook w:firstColumn="1" w:firstRow="1" w:lastColumn="0" w:lastRow="0" w:noHBand="0" w:noVBand="1" w:val="04A0"/>
+        <w:bidiVisual/>
+      </w:tblPr>
+      <w:tblGrid>
+        <w:gridCol w:w="9972"/>
+      </w:tblGrid>
+      <w:tr>
+        <w:tc>
+          <w:tcPr>
+            <w:tcW w:type="dxa" w:w="9972"/>
+            <w:shd w:val="clear" w:color="auto" w:fill="FEF3C7"/>
+          </w:tcPr>
+          <w:p>
+            <w:pPr>
+              <w:bidi/>
+              <w:jc w:val="right"/>
+            </w:pPr>
+            <w:r>
+              <w:rPr>
+                <w:b/>
+                <w:sz w:val="21"/>
+                <w:rtl/>
+                <w:rFonts w:ascii="Tahoma" w:hAnsi="Tahoma" w:cs="Tahoma" w:eastAsia="Tahoma"/>
+                <w:szCs w:val="21"/>
+                <w:bCs/>
+              </w:rPr>
+              <w:t xml:space="preserve">انتبه: </w:t>
+            </w:r>
+            <w:r>
+              <w:rPr>
+                <w:sz w:val="21"/>
+                <w:rtl/>
+                <w:rFonts w:ascii="Tahoma" w:hAnsi="Tahoma" w:cs="Tahoma" w:eastAsia="Tahoma"/>
+                <w:szCs w:val="21"/>
+              </w:rPr>
+              <w:t>أمر الصرف مستند للطباعة والتوقيع فقط. لا يسجّل صرفاً في كشف حساب المقاول أو المورد. سجّل الدفعة نفسها من دورة الصرف أو «تسجيل الصرف» أو تبويب «الحساب» للمورد.</w:t>
+            </w:r>
+          </w:p>
+        </w:tc>
+      </w:tr>
+    </w:tbl>
+    <w:p>
+      <w:pPr>
+        <w:spacing w:after="40"/>
+      </w:pPr>
+    </w:p>
+    <w:tbl>
+      <w:tblPr>
+        <w:tblW w:type="auto" w:w="0"/>
+        <w:jc w:val="center"/>
+        <w:tblLook w:firstColumn="1" w:firstRow="1" w:lastColumn="0" w:lastRow="0" w:noHBand="0" w:noVBand="1" w:val="04A0"/>
+        <w:bidiVisual/>
+      </w:tblPr>
+      <w:tblGrid>
+        <w:gridCol w:w="9972"/>
+      </w:tblGrid>
+      <w:tr>
+        <w:tc>
+          <w:tcPr>
+            <w:tcW w:type="dxa" w:w="9972"/>
+            <w:shd w:val="clear" w:color="auto" w:fill="E6EFF0"/>
+          </w:tcPr>
+          <w:p>
+            <w:pPr>
+              <w:bidi/>
+              <w:jc w:val="right"/>
+            </w:pPr>
+            <w:r>
+              <w:rPr>
+                <w:b/>
+                <w:sz w:val="21"/>
+                <w:rtl/>
+                <w:rFonts w:ascii="Tahoma" w:hAnsi="Tahoma" w:cs="Tahoma" w:eastAsia="Tahoma"/>
+                <w:szCs w:val="21"/>
+                <w:bCs/>
+              </w:rPr>
+              <w:t xml:space="preserve">ملاحظة: </w:t>
+            </w:r>
+            <w:r>
+              <w:rPr>
+                <w:sz w:val="21"/>
+                <w:rtl/>
+                <w:rFonts w:ascii="Tahoma" w:hAnsi="Tahoma" w:cs="Tahoma" w:eastAsia="Tahoma"/>
+                <w:szCs w:val="21"/>
+              </w:rPr>
+              <w:t>أسماء الموقّعين الأربعة والقسم الافتراضي تُحدَّد مرة واحدة من «بيانات الشركة»، ويمكن تغييرها في أمر بعينه من قسم «التوقيعات والملاحظات».</w:t>
+            </w:r>
+          </w:p>
+        </w:tc>
+      </w:tr>
+    </w:tbl>
+    <w:p>
+      <w:pPr>
+        <w:spacing w:after="40"/>
+      </w:pPr>
+    </w:p>
+    <w:p>
+      <w:pPr>
+        <w:keepNext/>
+        <w:bidi/>
+        <w:spacing w:after="160" w:before="280"/>
+        <w:jc w:val="right"/>
+      </w:pPr>
+      <w:r>
+        <w:rPr>
+          <w:b/>
+          <w:color w:val="29595E"/>
+          <w:sz w:val="36"/>
+          <w:rtl/>
+          <w:rFonts w:ascii="Tahoma" w:hAnsi="Tahoma" w:cs="Tahoma" w:eastAsia="Tahoma"/>
+          <w:szCs w:val="36"/>
+          <w:bCs/>
+        </w:rPr>
+        <w:t>10. الأرشيف وإقفال المعاملة</w:t>
       </w:r>
     </w:p>
     <w:p>
@@ -3791,7 +5149,7 @@
           <w:szCs w:val="36"/>
           <w:bCs/>
         </w:rPr>
-        <w:t>8. رسائل المنع الشائعة ومعناها</w:t>
+        <w:t>11. رسائل المنع الشائعة ومعناها</w:t>
       </w:r>
     </w:p>
     <w:tbl>
@@ -4217,7 +5575,7 @@
           <w:szCs w:val="36"/>
           <w:bCs/>
         </w:rPr>
-        <w:t>9. لمدير النظام فقط</w:t>
+        <w:t>12. لمدير النظام فقط</w:t>
       </w:r>
     </w:p>
     <w:p>
@@ -4291,7 +5649,61 @@
           <w:rFonts w:ascii="Tahoma" w:hAnsi="Tahoma" w:cs="Tahoma" w:eastAsia="Tahoma"/>
           <w:szCs w:val="22"/>
         </w:rPr>
-        <w:t>3.  عند تغيير كلمة مرور مستخدم أو دوره أو تعطيله تُنهى جلساته المفتوحة فوراً.</w:t>
+        <w:t>3.  صلاحيات جديدة: «أرصدة الافتتاح» (المالية)، و«حركات كشف حساب المورد»، وثلاث لأوامر الصرف (عرض، إنشاء، اعتماد).</w:t>
+      </w:r>
+    </w:p>
+    <w:p>
+      <w:pPr>
+        <w:bidi/>
+        <w:spacing w:after="60"/>
+        <w:ind w:right="227"/>
+        <w:jc w:val="right"/>
+      </w:pPr>
+      <w:r>
+        <w:rPr>
+          <w:b w:val="0"/>
+          <w:sz w:val="22"/>
+          <w:rtl/>
+          <w:rFonts w:ascii="Tahoma" w:hAnsi="Tahoma" w:cs="Tahoma" w:eastAsia="Tahoma"/>
+          <w:szCs w:val="22"/>
+        </w:rPr>
+        <w:t>4.  «بيانات الشركة»: اكتب أسماء الموقّعين الأربعة (المحاسب، مدير الحسابات، المدير المالي، المدير العام) والقسم الطالب الافتراضي لنموذج «طلب الصرف».</w:t>
+      </w:r>
+    </w:p>
+    <w:p>
+      <w:pPr>
+        <w:bidi/>
+        <w:spacing w:after="60"/>
+        <w:ind w:right="227"/>
+        <w:jc w:val="right"/>
+      </w:pPr>
+      <w:r>
+        <w:rPr>
+          <w:b w:val="0"/>
+          <w:sz w:val="22"/>
+          <w:rtl/>
+          <w:rFonts w:ascii="Tahoma" w:hAnsi="Tahoma" w:cs="Tahoma" w:eastAsia="Tahoma"/>
+          <w:szCs w:val="22"/>
+        </w:rPr>
+        <w:t>5.  ترقيم أوامر الصرف: في «الطباعة» قبل إنشاء أول أمر اكتب «أول رقم يُصدَر من هذا النظام» لمتابعة ترقيم النظام القديم (مثلاً 27 بعد PR-0026).</w:t>
+      </w:r>
+    </w:p>
+    <w:p>
+      <w:pPr>
+        <w:bidi/>
+        <w:spacing w:after="60"/>
+        <w:ind w:right="227"/>
+        <w:jc w:val="right"/>
+      </w:pPr>
+      <w:r>
+        <w:rPr>
+          <w:b w:val="0"/>
+          <w:sz w:val="22"/>
+          <w:rtl/>
+          <w:rFonts w:ascii="Tahoma" w:hAnsi="Tahoma" w:cs="Tahoma" w:eastAsia="Tahoma"/>
+          <w:szCs w:val="22"/>
+        </w:rPr>
+        <w:t>6.  عند تغيير كلمة مرور مستخدم أو دوره أو تعطيله تُنهى جلساته المفتوحة فوراً.</w:t>
       </w:r>
     </w:p>
     <w:p>
@@ -4795,7 +6207,7 @@
           <w:szCs w:val="36"/>
           <w:bCs/>
         </w:rPr>
-        <w:t>10. أسئلة شائعة</w:t>
+        <w:t>13. أسئلة شائعة</w:t>
       </w:r>
     </w:p>
     <w:p>

</xml_diff>

<commit_message>
v26.1: simplified 'Payment request' form (company layout), new signatories, and the choice to add the payment to the account statement on approval (atomic, once)
Co-Authored-By: Claude Sonnet 5.5 <noreply@anthropic.com>
Claude-Session: https://claude.ai/code/session_01SHGXLMzTpjgSYCYG6UniWT
</commit_message>
<xml_diff>
--- a/po_web/docs/دليل_المستخدم.docx
+++ b/po_web/docs/دليل_المستخدم.docx
@@ -4162,7 +4162,7 @@
           <w:rFonts w:ascii="Tahoma" w:hAnsi="Tahoma" w:cs="Tahoma" w:eastAsia="Tahoma"/>
           <w:szCs w:val="22"/>
         </w:rPr>
-        <w:t>3.  يظهر مربع بمستندات هذا المستفيد المستحقة على المشروع (مستخلصات المقاول أو أوامر شراء المورد). علّم ما تريد صرفه: يُضاف كبند وكمستند مرجعي تلقائياً بمبلغه.</w:t>
+        <w:t>3.  يظهر مربع بمستندات هذا المستفيد المستحقة على المشروع (مستخلصات المقاول أو أوامر شراء المورد). علّم ما تريد صرفه: يُضاف كبند ومستند مرجعي تلقائياً بمبلغه الشامل للضريبة.</w:t>
       </w:r>
     </w:p>
     <w:p>
@@ -4180,7 +4180,7 @@
           <w:rFonts w:ascii="Tahoma" w:hAnsi="Tahoma" w:cs="Tahoma" w:eastAsia="Tahoma"/>
           <w:szCs w:val="22"/>
         </w:rPr>
-        <w:t>4.  أكمل: نوع الطلب، القسم الطالب، مركز التكلفة (افتراضياً اسم المشروع)، طريقة السداد، بيان السداد، والبيان. يمكنك إضافة بنود ومستندات مرجعية يدوياً.</w:t>
+        <w:t>4.  أكمل: نوع الطلب، والقسم (يظهر تحت اسم الشركة)، ومركز التكلفة (افتراضياً اسم المشروع)، وطريقة السداد، والبيان. يمكنك إضافة بنود يدوياً: لكل بند بيان ومبلغ.</w:t>
       </w:r>
     </w:p>
     <w:p>
@@ -4198,7 +4198,7 @@
           <w:rFonts w:ascii="Tahoma" w:hAnsi="Tahoma" w:cs="Tahoma" w:eastAsia="Tahoma"/>
           <w:szCs w:val="22"/>
         </w:rPr>
-        <w:t>5.  اختر هل الأسعار شاملة الضريبة أم لا، وأضف خصماً إن وُجد (يُحسب بعد الضريبة). تظهر الإجماليات فوراً أسفل البنود.</w:t>
+        <w:t>5.  اختر هل الأسعار شاملة الضريبة أم لا، وأضف خصماً إن وُجد (يُحسب بعد الضريبة). تظهر الإجماليات فوراً تحت البنود.</w:t>
       </w:r>
     </w:p>
     <w:p>
@@ -4216,7 +4216,313 @@
           <w:rFonts w:ascii="Tahoma" w:hAnsi="Tahoma" w:cs="Tahoma" w:eastAsia="Tahoma"/>
           <w:szCs w:val="22"/>
         </w:rPr>
-        <w:t>6.  اضغط «حفظ كمسودة». يُعطى الأمر رقماً تلقائياً (PR-0027 مثلاً).</w:t>
+        <w:t>6.  أجب عن السؤال: «هل تريد إضافة هذه الدفعة إلى كشف حساب المورد / المقاول؟» (انظر الجدول أدناه).</w:t>
+      </w:r>
+    </w:p>
+    <w:p>
+      <w:pPr>
+        <w:bidi/>
+        <w:spacing w:after="60"/>
+        <w:ind w:right="227"/>
+        <w:jc w:val="right"/>
+      </w:pPr>
+      <w:r>
+        <w:rPr>
+          <w:b w:val="0"/>
+          <w:sz w:val="22"/>
+          <w:rtl/>
+          <w:rFonts w:ascii="Tahoma" w:hAnsi="Tahoma" w:cs="Tahoma" w:eastAsia="Tahoma"/>
+          <w:szCs w:val="22"/>
+        </w:rPr>
+        <w:t>7.  اضغط «حفظ كمسودة»، أو «حفظ واعتماد» إن كان لديك صلاحية الاعتماد. يُعطى الأمر رقماً تلقائياً (PR-0027 مثلاً).</w:t>
+      </w:r>
+    </w:p>
+    <w:p>
+      <w:pPr>
+        <w:keepNext/>
+        <w:bidi/>
+        <w:spacing w:after="80" w:before="160"/>
+        <w:jc w:val="right"/>
+      </w:pPr>
+      <w:r>
+        <w:rPr>
+          <w:b/>
+          <w:color w:val="29595E"/>
+          <w:sz w:val="26"/>
+          <w:rtl/>
+          <w:rFonts w:ascii="Tahoma" w:hAnsi="Tahoma" w:cs="Tahoma" w:eastAsia="Tahoma"/>
+          <w:szCs w:val="26"/>
+          <w:bCs/>
+        </w:rPr>
+        <w:t>سؤال: هل تضيف الدفعة إلى كشف الحساب؟</w:t>
+      </w:r>
+    </w:p>
+    <w:tbl>
+      <w:tblPr>
+        <w:tblStyle w:val="TableGrid"/>
+        <w:tblW w:type="auto" w:w="0"/>
+        <w:jc w:val="center"/>
+        <w:tblLayout w:type="fixed"/>
+        <w:tblLook w:firstColumn="1" w:firstRow="1" w:lastColumn="0" w:lastRow="0" w:noHBand="0" w:noVBand="1" w:val="04A0"/>
+        <w:bidiVisual/>
+        <w:tblLayout w:type="fixed"/>
+      </w:tblPr>
+      <w:tblGrid>
+        <w:gridCol w:w="1984"/>
+        <w:gridCol w:w="7654"/>
+      </w:tblGrid>
+      <w:tr>
+        <w:tc>
+          <w:tcPr>
+            <w:tcW w:type="dxa" w:w="1984"/>
+            <w:shd w:val="clear" w:color="auto" w:fill="29595E"/>
+          </w:tcPr>
+          <w:p>
+            <w:pPr>
+              <w:bidi/>
+              <w:jc w:val="right"/>
+            </w:pPr>
+            <w:r>
+              <w:rPr>
+                <w:b/>
+                <w:color w:val="FFFFFF"/>
+                <w:sz w:val="21"/>
+                <w:rtl/>
+                <w:rFonts w:ascii="Tahoma" w:hAnsi="Tahoma" w:cs="Tahoma" w:eastAsia="Tahoma"/>
+                <w:szCs w:val="21"/>
+                <w:bCs/>
+              </w:rPr>
+              <w:t>الجواب</w:t>
+            </w:r>
+          </w:p>
+        </w:tc>
+        <w:tc>
+          <w:tcPr>
+            <w:tcW w:type="dxa" w:w="7654"/>
+            <w:shd w:val="clear" w:color="auto" w:fill="29595E"/>
+          </w:tcPr>
+          <w:p>
+            <w:pPr>
+              <w:bidi/>
+              <w:jc w:val="right"/>
+            </w:pPr>
+            <w:r>
+              <w:rPr>
+                <w:b/>
+                <w:color w:val="FFFFFF"/>
+                <w:sz w:val="21"/>
+                <w:rtl/>
+                <w:rFonts w:ascii="Tahoma" w:hAnsi="Tahoma" w:cs="Tahoma" w:eastAsia="Tahoma"/>
+                <w:szCs w:val="21"/>
+                <w:bCs/>
+              </w:rPr>
+              <w:t>ماذا يحدث</w:t>
+            </w:r>
+          </w:p>
+        </w:tc>
+      </w:tr>
+      <w:tr>
+        <w:tc>
+          <w:tcPr>
+            <w:tcW w:type="dxa" w:w="1984"/>
+          </w:tcPr>
+          <w:p>
+            <w:pPr>
+              <w:bidi/>
+              <w:jc w:val="right"/>
+            </w:pPr>
+            <w:r>
+              <w:rPr>
+                <w:sz w:val="21"/>
+                <w:rtl/>
+                <w:rFonts w:ascii="Tahoma" w:hAnsi="Tahoma" w:cs="Tahoma" w:eastAsia="Tahoma"/>
+                <w:szCs w:val="21"/>
+              </w:rPr>
+              <w:t>لا (الافتراضي)</w:t>
+            </w:r>
+          </w:p>
+        </w:tc>
+        <w:tc>
+          <w:tcPr>
+            <w:tcW w:type="dxa" w:w="7654"/>
+          </w:tcPr>
+          <w:p>
+            <w:pPr>
+              <w:bidi/>
+              <w:jc w:val="right"/>
+            </w:pPr>
+            <w:r>
+              <w:rPr>
+                <w:sz w:val="21"/>
+                <w:rtl/>
+                <w:rFonts w:ascii="Tahoma" w:hAnsi="Tahoma" w:cs="Tahoma" w:eastAsia="Tahoma"/>
+                <w:szCs w:val="21"/>
+              </w:rPr>
+              <w:t>الأمر للطباعة والتوقيع فقط، ولا يتغير أي كشف حساب.</w:t>
+            </w:r>
+          </w:p>
+        </w:tc>
+      </w:tr>
+      <w:tr>
+        <w:tc>
+          <w:tcPr>
+            <w:tcW w:type="dxa" w:w="1984"/>
+          </w:tcPr>
+          <w:p>
+            <w:pPr>
+              <w:bidi/>
+              <w:jc w:val="right"/>
+            </w:pPr>
+            <w:r>
+              <w:rPr>
+                <w:sz w:val="21"/>
+                <w:rtl/>
+                <w:rFonts w:ascii="Tahoma" w:hAnsi="Tahoma" w:cs="Tahoma" w:eastAsia="Tahoma"/>
+                <w:szCs w:val="21"/>
+              </w:rPr>
+              <w:t>نعم — لمقاول</w:t>
+            </w:r>
+          </w:p>
+        </w:tc>
+        <w:tc>
+          <w:tcPr>
+            <w:tcW w:type="dxa" w:w="7654"/>
+          </w:tcPr>
+          <w:p>
+            <w:pPr>
+              <w:bidi/>
+              <w:jc w:val="right"/>
+            </w:pPr>
+            <w:r>
+              <w:rPr>
+                <w:sz w:val="21"/>
+                <w:rtl/>
+                <w:rFonts w:ascii="Tahoma" w:hAnsi="Tahoma" w:cs="Tahoma" w:eastAsia="Tahoma"/>
+                <w:szCs w:val="21"/>
+              </w:rPr>
+              <w:t>عند اعتماد الأمر تُسجَّل الدفعة «تم التحويل». إن ذكرتَ مستخلصاً سحبتَه من القائمة ومبلغه يطابق متبقّيه فيُغلق صرفه تماماً كزر «تسجيل الصرف». وإن لم يطابق أو لم تذكر مستخلصاً تُسجَّل «دفعة مباشرة» في كشف المقاول دون تغيير حالة أي مستخلص.</w:t>
+            </w:r>
+          </w:p>
+        </w:tc>
+      </w:tr>
+      <w:tr>
+        <w:tc>
+          <w:tcPr>
+            <w:tcW w:type="dxa" w:w="1984"/>
+          </w:tcPr>
+          <w:p>
+            <w:pPr>
+              <w:bidi/>
+              <w:jc w:val="right"/>
+            </w:pPr>
+            <w:r>
+              <w:rPr>
+                <w:sz w:val="21"/>
+                <w:rtl/>
+                <w:rFonts w:ascii="Tahoma" w:hAnsi="Tahoma" w:cs="Tahoma" w:eastAsia="Tahoma"/>
+                <w:szCs w:val="21"/>
+              </w:rPr>
+              <w:t>نعم — لمورد</w:t>
+            </w:r>
+          </w:p>
+        </w:tc>
+        <w:tc>
+          <w:tcPr>
+            <w:tcW w:type="dxa" w:w="7654"/>
+          </w:tcPr>
+          <w:p>
+            <w:pPr>
+              <w:bidi/>
+              <w:jc w:val="right"/>
+            </w:pPr>
+            <w:r>
+              <w:rPr>
+                <w:sz w:val="21"/>
+                <w:rtl/>
+                <w:rFonts w:ascii="Tahoma" w:hAnsi="Tahoma" w:cs="Tahoma" w:eastAsia="Tahoma"/>
+                <w:szCs w:val="21"/>
+              </w:rPr>
+              <w:t>عند الاعتماد تُسجَّل دفعة في كشف حساب المورد (مرتبطة بأمر الشراء إن كان واحداً فقط، حتى لا يُحتسب مرتين).</w:t>
+            </w:r>
+          </w:p>
+        </w:tc>
+      </w:tr>
+    </w:tbl>
+    <w:p>
+      <w:pPr>
+        <w:spacing w:after="40"/>
+      </w:pPr>
+    </w:p>
+    <w:p>
+      <w:pPr>
+        <w:bidi/>
+        <w:spacing w:after="60"/>
+        <w:ind w:right="227"/>
+        <w:jc w:val="right"/>
+      </w:pPr>
+      <w:r>
+        <w:rPr>
+          <w:b w:val="0"/>
+          <w:sz w:val="22"/>
+          <w:rtl/>
+          <w:rFonts w:ascii="Tahoma" w:hAnsi="Tahoma" w:cs="Tahoma" w:eastAsia="Tahoma"/>
+          <w:szCs w:val="22"/>
+        </w:rPr>
+        <w:t>•  لا يُسجَّل شيء قبل الاعتماد. والاعتماد والتسجيل يتمان معاً أو لا يتم أيٌّ منهما.</w:t>
+      </w:r>
+    </w:p>
+    <w:p>
+      <w:pPr>
+        <w:bidi/>
+        <w:spacing w:after="60"/>
+        <w:ind w:right="227"/>
+        <w:jc w:val="right"/>
+      </w:pPr>
+      <w:r>
+        <w:rPr>
+          <w:b w:val="0"/>
+          <w:sz w:val="22"/>
+          <w:rtl/>
+          <w:rFonts w:ascii="Tahoma" w:hAnsi="Tahoma" w:cs="Tahoma" w:eastAsia="Tahoma"/>
+          <w:szCs w:val="22"/>
+        </w:rPr>
+        <w:t>•  إن كان المستخلص ضمن دورة صرف مفتوحة يرفض النظام الاعتماد ويطلب تنفيذ تحويله من الدورة.</w:t>
+      </w:r>
+    </w:p>
+    <w:p>
+      <w:pPr>
+        <w:bidi/>
+        <w:spacing w:after="60"/>
+        <w:ind w:right="227"/>
+        <w:jc w:val="right"/>
+      </w:pPr>
+      <w:r>
+        <w:rPr>
+          <w:b w:val="0"/>
+          <w:sz w:val="22"/>
+          <w:rtl/>
+          <w:rFonts w:ascii="Tahoma" w:hAnsi="Tahoma" w:cs="Tahoma" w:eastAsia="Tahoma"/>
+          <w:szCs w:val="22"/>
+        </w:rPr>
+        <w:t>•  لا يمكن تسجيل دفعة بتاريخ يسبق تاريخ رصيد الافتتاح للطرف.</w:t>
+      </w:r>
+    </w:p>
+    <w:p>
+      <w:pPr>
+        <w:bidi/>
+        <w:spacing w:after="60"/>
+        <w:ind w:right="227"/>
+        <w:jc w:val="right"/>
+      </w:pPr>
+      <w:r>
+        <w:rPr>
+          <w:b w:val="0"/>
+          <w:sz w:val="22"/>
+          <w:rtl/>
+          <w:rFonts w:ascii="Tahoma" w:hAnsi="Tahoma" w:cs="Tahoma" w:eastAsia="Tahoma"/>
+          <w:szCs w:val="22"/>
+        </w:rPr>
+        <w:t>•  الأمر الذي سُجّلت دفعته لا يُلغى قبل إزالة الدفعة من الكشف (من المستخلص «إلغاء تسجيل الصرف»، أو حذف الدفعة المباشرة / دفعة المورد التي تحمل رقم الأمر).</w:t>
       </w:r>
     </w:p>
     <w:p>
@@ -4466,7 +4772,7 @@
                 <w:rFonts w:ascii="Tahoma" w:hAnsi="Tahoma" w:cs="Tahoma" w:eastAsia="Tahoma"/>
                 <w:szCs w:val="21"/>
               </w:rPr>
-              <w:t>يثبّت الأمر ولا يعود قابلاً للتعديل (لمن عنده صلاحية الاعتماد).</w:t>
+              <w:t>يثبّت الأمر ولا يعود قابلاً للتعديل (لمن عنده صلاحية الاعتماد)، وينفّذ إضافة الدفعة إن اخترت «نعم».</w:t>
             </w:r>
           </w:p>
         </w:tc>
@@ -4519,55 +4825,115 @@
         <w:spacing w:after="40"/>
       </w:pPr>
     </w:p>
-    <w:tbl>
-      <w:tblPr>
-        <w:tblW w:type="auto" w:w="0"/>
-        <w:jc w:val="center"/>
-        <w:tblLook w:firstColumn="1" w:firstRow="1" w:lastColumn="0" w:lastRow="0" w:noHBand="0" w:noVBand="1" w:val="04A0"/>
-        <w:bidiVisual/>
-      </w:tblPr>
-      <w:tblGrid>
-        <w:gridCol w:w="9972"/>
-      </w:tblGrid>
-      <w:tr>
-        <w:tc>
-          <w:tcPr>
-            <w:tcW w:type="dxa" w:w="9972"/>
-            <w:shd w:val="clear" w:color="auto" w:fill="FEF3C7"/>
-          </w:tcPr>
-          <w:p>
-            <w:pPr>
-              <w:bidi/>
-              <w:jc w:val="right"/>
-            </w:pPr>
-            <w:r>
-              <w:rPr>
-                <w:b/>
-                <w:sz w:val="21"/>
-                <w:rtl/>
-                <w:rFonts w:ascii="Tahoma" w:hAnsi="Tahoma" w:cs="Tahoma" w:eastAsia="Tahoma"/>
-                <w:szCs w:val="21"/>
-                <w:bCs/>
-              </w:rPr>
-              <w:t xml:space="preserve">انتبه: </w:t>
-            </w:r>
-            <w:r>
-              <w:rPr>
-                <w:sz w:val="21"/>
-                <w:rtl/>
-                <w:rFonts w:ascii="Tahoma" w:hAnsi="Tahoma" w:cs="Tahoma" w:eastAsia="Tahoma"/>
-                <w:szCs w:val="21"/>
-              </w:rPr>
-              <w:t>أمر الصرف مستند للطباعة والتوقيع فقط. لا يسجّل صرفاً في كشف حساب المقاول أو المورد. سجّل الدفعة نفسها من دورة الصرف أو «تسجيل الصرف» أو تبويب «الحساب» للمورد.</w:t>
-            </w:r>
-          </w:p>
-        </w:tc>
-      </w:tr>
-    </w:tbl>
     <w:p>
       <w:pPr>
-        <w:spacing w:after="40"/>
-      </w:pPr>
+        <w:keepNext/>
+        <w:bidi/>
+        <w:spacing w:after="80" w:before="160"/>
+        <w:jc w:val="right"/>
+      </w:pPr>
+      <w:r>
+        <w:rPr>
+          <w:b/>
+          <w:color w:val="29595E"/>
+          <w:sz w:val="26"/>
+          <w:rtl/>
+          <w:rFonts w:ascii="Tahoma" w:hAnsi="Tahoma" w:cs="Tahoma" w:eastAsia="Tahoma"/>
+          <w:szCs w:val="26"/>
+          <w:bCs/>
+        </w:rPr>
+        <w:t>ما يُطبع في النموذج</w:t>
+      </w:r>
+    </w:p>
+    <w:p>
+      <w:pPr>
+        <w:bidi/>
+        <w:spacing w:after="60"/>
+        <w:ind w:right="227"/>
+        <w:jc w:val="right"/>
+      </w:pPr>
+      <w:r>
+        <w:rPr>
+          <w:b w:val="0"/>
+          <w:sz w:val="22"/>
+          <w:rtl/>
+          <w:rFonts w:ascii="Tahoma" w:hAnsi="Tahoma" w:cs="Tahoma" w:eastAsia="Tahoma"/>
+          <w:szCs w:val="22"/>
+        </w:rPr>
+        <w:t>•  اسم الشركة والقسم والشعار، ورقم الطلب والتاريخ.</w:t>
+      </w:r>
+    </w:p>
+    <w:p>
+      <w:pPr>
+        <w:bidi/>
+        <w:spacing w:after="60"/>
+        <w:ind w:right="227"/>
+        <w:jc w:val="right"/>
+      </w:pPr>
+      <w:r>
+        <w:rPr>
+          <w:b w:val="0"/>
+          <w:sz w:val="22"/>
+          <w:rtl/>
+          <w:rFonts w:ascii="Tahoma" w:hAnsi="Tahoma" w:cs="Tahoma" w:eastAsia="Tahoma"/>
+          <w:szCs w:val="22"/>
+        </w:rPr>
+        <w:t>•  المستفيد، ونوع الطلب، وطريقة السداد، ومركز التكلفة، والبيان.</w:t>
+      </w:r>
+    </w:p>
+    <w:p>
+      <w:pPr>
+        <w:bidi/>
+        <w:spacing w:after="60"/>
+        <w:ind w:right="227"/>
+        <w:jc w:val="right"/>
+      </w:pPr>
+      <w:r>
+        <w:rPr>
+          <w:b w:val="0"/>
+          <w:sz w:val="22"/>
+          <w:rtl/>
+          <w:rFonts w:ascii="Tahoma" w:hAnsi="Tahoma" w:cs="Tahoma" w:eastAsia="Tahoma"/>
+          <w:szCs w:val="22"/>
+        </w:rPr>
+        <w:t>•  بنود الطلب بمبالغها، والمبلغ بالحروف (صافي القيمة دائماً).</w:t>
+      </w:r>
+    </w:p>
+    <w:p>
+      <w:pPr>
+        <w:bidi/>
+        <w:spacing w:after="60"/>
+        <w:ind w:right="227"/>
+        <w:jc w:val="right"/>
+      </w:pPr>
+      <w:r>
+        <w:rPr>
+          <w:b w:val="0"/>
+          <w:sz w:val="22"/>
+          <w:rtl/>
+          <w:rFonts w:ascii="Tahoma" w:hAnsi="Tahoma" w:cs="Tahoma" w:eastAsia="Tahoma"/>
+          <w:szCs w:val="22"/>
+        </w:rPr>
+        <w:t>•  جدول الضريبة والإجماليات لا يُطبع إلا إن علّمتَ خانة «اطبع جدول الضريبة والإجماليات».</w:t>
+      </w:r>
+    </w:p>
+    <w:p>
+      <w:pPr>
+        <w:bidi/>
+        <w:spacing w:after="60"/>
+        <w:ind w:right="227"/>
+        <w:jc w:val="right"/>
+      </w:pPr>
+      <w:r>
+        <w:rPr>
+          <w:b w:val="0"/>
+          <w:sz w:val="22"/>
+          <w:rtl/>
+          <w:rFonts w:ascii="Tahoma" w:hAnsi="Tahoma" w:cs="Tahoma" w:eastAsia="Tahoma"/>
+          <w:szCs w:val="22"/>
+        </w:rPr>
+        <w:t>•  التوقيعات من اليمين: مدير العقود والمشتريات، مدير عام المشاريع، مدير الحسابات، المدير المالي، المدير العام.</w:t>
+      </w:r>
     </w:p>
     <w:tbl>
       <w:tblPr>
@@ -4608,7 +4974,7 @@
                 <w:rFonts w:ascii="Tahoma" w:hAnsi="Tahoma" w:cs="Tahoma" w:eastAsia="Tahoma"/>
                 <w:szCs w:val="21"/>
               </w:rPr>
-              <w:t>أسماء الموقّعين الأربعة والقسم الافتراضي تُحدَّد مرة واحدة من «بيانات الشركة»، ويمكن تغييرها في أمر بعينه من قسم «التوقيعات والملاحظات».</w:t>
+              <w:t>أسماء الموقّعين والقسم الافتراضي تُحدَّد مرة واحدة من «بيانات الشركة»، ويمكن تغييرها في أمر بعينه من قسم «التوقيعات والملاحظات».</w:t>
             </w:r>
           </w:p>
         </w:tc>

</xml_diff>

<commit_message>
v26.2: company page matches the voucher signatories; archive PDF copy of every approved voucher
Co-Authored-By: Claude Sonnet 5.5 <noreply@anthropic.com>
Claude-Session: https://claude.ai/code/session_01SHGXLMzTpjgSYCYG6UniWT
</commit_message>
<xml_diff>
--- a/po_web/docs/دليل_المستخدم.docx
+++ b/po_web/docs/دليل_المستخدم.docx
@@ -4819,11 +4819,127 @@
           </w:p>
         </w:tc>
       </w:tr>
+      <w:tr>
+        <w:tc>
+          <w:tcPr>
+            <w:tcW w:type="dxa" w:w="2268"/>
+          </w:tcPr>
+          <w:p>
+            <w:pPr>
+              <w:bidi/>
+              <w:jc w:val="right"/>
+            </w:pPr>
+            <w:r>
+              <w:rPr>
+                <w:sz w:val="21"/>
+                <w:rtl/>
+                <w:rFonts w:ascii="Tahoma" w:hAnsi="Tahoma" w:cs="Tahoma" w:eastAsia="Tahoma"/>
+                <w:szCs w:val="21"/>
+              </w:rPr>
+              <w:t>حفظ نسخة في الأرشيف</w:t>
+            </w:r>
+          </w:p>
+        </w:tc>
+        <w:tc>
+          <w:tcPr>
+            <w:tcW w:type="dxa" w:w="7370"/>
+          </w:tcPr>
+          <w:p>
+            <w:pPr>
+              <w:bidi/>
+              <w:jc w:val="right"/>
+            </w:pPr>
+            <w:r>
+              <w:rPr>
+                <w:sz w:val="21"/>
+                <w:rtl/>
+                <w:rFonts w:ascii="Tahoma" w:hAnsi="Tahoma" w:cs="Tahoma" w:eastAsia="Tahoma"/>
+                <w:szCs w:val="21"/>
+              </w:rPr>
+              <w:t>ينشئ نسخة PDF في الأرشيف (تُنشأ تلقائياً عند الاعتماد).</w:t>
+            </w:r>
+          </w:p>
+        </w:tc>
+      </w:tr>
     </w:tbl>
     <w:p>
       <w:pPr>
         <w:spacing w:after="40"/>
       </w:pPr>
+    </w:p>
+    <w:p>
+      <w:pPr>
+        <w:keepNext/>
+        <w:bidi/>
+        <w:spacing w:after="80" w:before="160"/>
+        <w:jc w:val="right"/>
+      </w:pPr>
+      <w:r>
+        <w:rPr>
+          <w:b/>
+          <w:color w:val="29595E"/>
+          <w:sz w:val="26"/>
+          <w:rtl/>
+          <w:rFonts w:ascii="Tahoma" w:hAnsi="Tahoma" w:cs="Tahoma" w:eastAsia="Tahoma"/>
+          <w:szCs w:val="26"/>
+          <w:bCs/>
+        </w:rPr>
+        <w:t>أين يُحفظ أمر الصرف؟</w:t>
+      </w:r>
+    </w:p>
+    <w:p>
+      <w:pPr>
+        <w:bidi/>
+        <w:spacing w:after="60"/>
+        <w:ind w:right="227"/>
+        <w:jc w:val="right"/>
+      </w:pPr>
+      <w:r>
+        <w:rPr>
+          <w:b w:val="0"/>
+          <w:sz w:val="22"/>
+          <w:rtl/>
+          <w:rFonts w:ascii="Tahoma" w:hAnsi="Tahoma" w:cs="Tahoma" w:eastAsia="Tahoma"/>
+          <w:szCs w:val="22"/>
+        </w:rPr>
+        <w:t>•  بياناته في قاعدة البيانات، وتجدها في «الطباعة ← أوامر الصرف العامة» (بحث بالرقم أو المستفيد أو المشروع). رابط كل أمر داخل النظام هو صفحته.</w:t>
+      </w:r>
+    </w:p>
+    <w:p>
+      <w:pPr>
+        <w:bidi/>
+        <w:spacing w:after="60"/>
+        <w:ind w:right="227"/>
+        <w:jc w:val="right"/>
+      </w:pPr>
+      <w:r>
+        <w:rPr>
+          <w:b w:val="0"/>
+          <w:sz w:val="22"/>
+          <w:rtl/>
+          <w:rFonts w:ascii="Tahoma" w:hAnsi="Tahoma" w:cs="Tahoma" w:eastAsia="Tahoma"/>
+          <w:szCs w:val="22"/>
+        </w:rPr>
+        <w:t>•  عند الاعتماد تُحفظ تلقائياً نسخة PDF في الأرشيف: أوامر الصرف العامة / السنة / PR-xxxx / PR-xxxx.pdf، ويظهر رابطها أعلى صفحة الأمر.</w:t>
+      </w:r>
+    </w:p>
+    <w:p>
+      <w:pPr>
+        <w:bidi/>
+        <w:spacing w:after="60"/>
+        <w:ind w:right="227"/>
+        <w:jc w:val="right"/>
+      </w:pPr>
+      <w:r>
+        <w:rPr>
+          <w:b w:val="0"/>
+          <w:sz w:val="22"/>
+          <w:rtl/>
+          <w:rFonts w:ascii="Tahoma" w:hAnsi="Tahoma" w:cs="Tahoma" w:eastAsia="Tahoma"/>
+          <w:szCs w:val="22"/>
+        </w:rPr>
+        <w:t>•  إن تعذّر إنشاء الـPDF لا يتأثر الاعتماد ولا الدفعة، وتظهر رسالة؛ اضغط لاحقاً «حفظ نسخة في الأرشيف».</w:t>
+      </w:r>
     </w:p>
     <w:p>
       <w:pPr>

</xml_diff>